<commit_message>
Rev 2: two errors per proofreading item, one-clause patterns, 5 vocabulary rows, one-paragraph writing task
</commit_message>
<xml_diff>
--- a/6B Grammar Lesson 3 - Discussing Solutions (Teacher's).docx
+++ b/6B Grammar Lesson 3 - Discussing Solutions (Teacher's).docx
@@ -69,7 +69,7 @@
         <w:rPr>
           <w:b w:val="0"/>
         </w:rPr>
-        <w:t>Each sentence below contains ONE error in the sentence patterns you learnt in Lesson 1 (introductions) and Lesson 2 (argument topic sentences). Find the error and write the corrected sentence.</w:t>
+        <w:t>Each sentence below contains TWO errors in the sentence patterns you learnt in Lesson 1 (introductions) and Lesson 2 (argument topic sentences). The errors are the common ones: agreement, tense, parts of speech, plurals and articles. Find both errors and write the corrected sentence.</w:t>
       </w:r>
     </w:p>
     <w:tbl>
@@ -100,7 +100,7 @@
               <w:rPr>
                 <w:b w:val="0"/>
               </w:rPr>
-              <w:t>In recent years, social media has become indispensable part of daily life for young people.</w:t>
+              <w:t>In recent years, social media has became indispensable part of daily life for young people.</w:t>
             </w:r>
           </w:p>
           <w:p>
@@ -114,7 +114,7 @@
               <w:rPr>
                 <w:b w:val="0"/>
               </w:rPr>
-              <w:t>Living in a fast-paced society, academic pressure has become increasingly heavy for students.</w:t>
+              <w:t>Living in a fast-paced society, students are constant exposed to academic stresses.</w:t>
             </w:r>
           </w:p>
           <w:p>
@@ -128,7 +128,7 @@
               <w:rPr>
                 <w:b w:val="0"/>
               </w:rPr>
-              <w:t>In recent times, the issue of plastic pollution have sparked widespread concern across society.</w:t>
+              <w:t>In recent times, issue of plastic pollution have sparked widespread concern across society.</w:t>
             </w:r>
           </w:p>
           <w:p>
@@ -142,7 +142,7 @@
               <w:rPr>
                 <w:b w:val="0"/>
               </w:rPr>
-              <w:t>It is undeniable that sleep plays a pivotal role to shape students’ memory and concentration.</w:t>
+              <w:t>It is undeniable that sleep play a pivotal role in shape students’ memory and concentration.</w:t>
             </w:r>
           </w:p>
           <w:p>
@@ -156,7 +156,7 @@
               <w:rPr>
                 <w:b w:val="0"/>
               </w:rPr>
-              <w:t>To begin with, part-time work offers students to gain real-world experience, paving the way for their future careers.</w:t>
+              <w:t>To begin with, part-time work offer students a golden opportunity to gain real-world experience, paving the way for their future career.</w:t>
             </w:r>
           </w:p>
           <w:p>
@@ -170,7 +170,7 @@
               <w:rPr>
                 <w:b w:val="0"/>
               </w:rPr>
-              <w:t>To begin with, volunteering offers teenagers a golden opportunity to meet new people, paved the way for a wider social circle.</w:t>
+              <w:t>To begin with, volunteering offers teenagers a golden opportunity to meet new peoples, paved the way for a wider social circle.</w:t>
             </w:r>
           </w:p>
           <w:p>
@@ -184,7 +184,7 @@
               <w:rPr>
                 <w:b w:val="0"/>
               </w:rPr>
-              <w:t>From the perspective of students, a balanced timetable allows them to manage their time wisely, which in turn boosting their academic performance.</w:t>
+              <w:t>From the perspective of students, a balanced timetable allow them to manage their time wisely, which in turn boosting their academic performance.</w:t>
             </w:r>
           </w:p>
           <w:p>
@@ -198,7 +198,7 @@
               <w:rPr>
                 <w:b w:val="0"/>
               </w:rPr>
-              <w:t>Team sports serve as a powerful means of relieve stress, which enables students to recharge both physically and mentally.</w:t>
+              <w:t>Team sports serves as a powerful means of relieve stress, which enables students to recharge both physically and mentally.</w:t>
             </w:r>
           </w:p>
           <w:p>
@@ -212,7 +212,7 @@
               <w:rPr>
                 <w:b w:val="0"/>
               </w:rPr>
-              <w:t>Admittedly, online lessons offer students greater flexibility, nevertheless, they cannot replace face-to-face interaction, as real-time discussion sparks deeper engagement.</w:t>
+              <w:t>Admittedly, online lessons offer students greater flexibility, nevertheless, they cannot replace face-to-face interaction, as real-time discussions sparks deeper engagement.</w:t>
             </w:r>
           </w:p>
           <w:p>
@@ -226,7 +226,7 @@
               <w:rPr>
                 <w:b w:val="0"/>
               </w:rPr>
-              <w:t>Reading serves as a powerful means of broadening students’ horizons, which enable them to understand the world beyond the classroom.</w:t>
+              <w:t>Reading serve as the powerful means of broadening students’ horizons, which enables them to understand the world beyond the classroom.</w:t>
             </w:r>
           </w:p>
         </w:tc>
@@ -279,7 +279,7 @@
         </w:tc>
         <w:tc>
           <w:tcPr>
-            <w:tcW w:type="dxa" w:w="4535"/>
+            <w:tcW w:type="dxa" w:w="4422"/>
             <w:shd w:val="clear" w:color="auto" w:fill="D9D9D9"/>
           </w:tcPr>
           <w:p>
@@ -293,7 +293,7 @@
         </w:tc>
         <w:tc>
           <w:tcPr>
-            <w:tcW w:type="dxa" w:w="4535"/>
+            <w:tcW w:type="dxa" w:w="4649"/>
             <w:shd w:val="clear" w:color="auto" w:fill="D9D9D9"/>
           </w:tcPr>
           <w:p>
@@ -301,7 +301,7 @@
               <w:rPr>
                 <w:b/>
               </w:rPr>
-              <w:t>The error and why (pattern)</w:t>
+              <w:t>The TWO errors and why</w:t>
             </w:r>
           </w:p>
         </w:tc>
@@ -323,7 +323,7 @@
         </w:tc>
         <w:tc>
           <w:tcPr>
-            <w:tcW w:type="dxa" w:w="4535"/>
+            <w:tcW w:type="dxa" w:w="4422"/>
           </w:tcPr>
           <w:p>
             <w:r>
@@ -337,7 +337,7 @@
         </w:tc>
         <w:tc>
           <w:tcPr>
-            <w:tcW w:type="dxa" w:w="4535"/>
+            <w:tcW w:type="dxa" w:w="4649"/>
           </w:tcPr>
           <w:p>
             <w:r>
@@ -345,7 +345,16 @@
                 <w:b w:val="0"/>
                 <w:color w:val="C00000"/>
               </w:rPr>
-              <w:t>Missing article. The pattern is “an indispensable part of”: the singular countable noun “part” needs “an” before it. (Lesson 1, Pattern 1)</w:t>
+              <w:t>(a) Tense / verb form: “has became” → “has become” (after “has” we need the past participle).</w:t>
+            </w:r>
+          </w:p>
+          <w:p>
+            <w:r>
+              <w:rPr>
+                <w:b w:val="0"/>
+                <w:color w:val="C00000"/>
+              </w:rPr>
+              <w:t>(b) Article: “indispensable part” → “an indispensable part” (singular countable noun). (Lesson 1, Pattern 1)</w:t>
             </w:r>
           </w:p>
         </w:tc>
@@ -367,7 +376,7 @@
         </w:tc>
         <w:tc>
           <w:tcPr>
-            <w:tcW w:type="dxa" w:w="4535"/>
+            <w:tcW w:type="dxa" w:w="4422"/>
           </w:tcPr>
           <w:p>
             <w:r>
@@ -375,13 +384,13 @@
                 <w:b w:val="0"/>
                 <w:color w:val="C00000"/>
               </w:rPr>
-              <w:t>Living in a fast-paced society, students are constantly exposed to increasing academic pressure.</w:t>
+              <w:t>Living in a fast-paced society, students are constantly exposed to academic stress.</w:t>
             </w:r>
           </w:p>
         </w:tc>
         <w:tc>
           <w:tcPr>
-            <w:tcW w:type="dxa" w:w="4535"/>
+            <w:tcW w:type="dxa" w:w="4649"/>
           </w:tcPr>
           <w:p>
             <w:r>
@@ -389,7 +398,16 @@
                 <w:b w:val="0"/>
                 <w:color w:val="C00000"/>
               </w:rPr>
-              <w:t>Dangling participle. After “Living in a fast-paced society”, the subject of the main clause must be the people who do the living — “students”, not “academic pressure”. (Lesson 1, Pattern 2)</w:t>
+              <w:t>(a) Part of speech: “constant” → “constantly” (an adverb is needed to modify “exposed”).</w:t>
+            </w:r>
+          </w:p>
+          <w:p>
+            <w:r>
+              <w:rPr>
+                <w:b w:val="0"/>
+                <w:color w:val="C00000"/>
+              </w:rPr>
+              <w:t>(b) Plural: “academic stresses” → “academic stress” (“stress” is uncountable here). (Lesson 1, Pattern 2)</w:t>
             </w:r>
           </w:p>
         </w:tc>
@@ -411,7 +429,7 @@
         </w:tc>
         <w:tc>
           <w:tcPr>
-            <w:tcW w:type="dxa" w:w="4535"/>
+            <w:tcW w:type="dxa" w:w="4422"/>
           </w:tcPr>
           <w:p>
             <w:r>
@@ -425,7 +443,7 @@
         </w:tc>
         <w:tc>
           <w:tcPr>
-            <w:tcW w:type="dxa" w:w="4535"/>
+            <w:tcW w:type="dxa" w:w="4649"/>
           </w:tcPr>
           <w:p>
             <w:r>
@@ -433,7 +451,16 @@
                 <w:b w:val="0"/>
                 <w:color w:val="C00000"/>
               </w:rPr>
-              <w:t>Subject–verb agreement. The subject is “the issue” (singular), so the verb is “has sparked”, not “have sparked”. (Lesson 1, Pattern 3)</w:t>
+              <w:t>(a) Article: “issue of plastic pollution” → “the issue of plastic pollution”.</w:t>
+            </w:r>
+          </w:p>
+          <w:p>
+            <w:r>
+              <w:rPr>
+                <w:b w:val="0"/>
+                <w:color w:val="C00000"/>
+              </w:rPr>
+              <w:t>(b) Agreement: “have sparked” → “has sparked” (the subject is the singular “issue”). (Lesson 1, Pattern 3)</w:t>
             </w:r>
           </w:p>
         </w:tc>
@@ -455,7 +482,7 @@
         </w:tc>
         <w:tc>
           <w:tcPr>
-            <w:tcW w:type="dxa" w:w="4535"/>
+            <w:tcW w:type="dxa" w:w="4422"/>
           </w:tcPr>
           <w:p>
             <w:r>
@@ -469,7 +496,7 @@
         </w:tc>
         <w:tc>
           <w:tcPr>
-            <w:tcW w:type="dxa" w:w="4535"/>
+            <w:tcW w:type="dxa" w:w="4649"/>
           </w:tcPr>
           <w:p>
             <w:r>
@@ -477,7 +504,16 @@
                 <w:b w:val="0"/>
                 <w:color w:val="C00000"/>
               </w:rPr>
-              <w:t>Wrong preposition. The fixed collocation is “play a pivotal role IN + gerund”, never “role to + verb”. (Lesson 1, Pattern 4)</w:t>
+              <w:t>(a) Agreement: “sleep play” → “sleep plays”.</w:t>
+            </w:r>
+          </w:p>
+          <w:p>
+            <w:r>
+              <w:rPr>
+                <w:b w:val="0"/>
+                <w:color w:val="C00000"/>
+              </w:rPr>
+              <w:t>(b) Part of speech / verb form: “in shape” → “in shaping” (after the preposition “in” we need the –ing form). (Lesson 1, Pattern 4)</w:t>
             </w:r>
           </w:p>
         </w:tc>
@@ -499,7 +535,7 @@
         </w:tc>
         <w:tc>
           <w:tcPr>
-            <w:tcW w:type="dxa" w:w="4535"/>
+            <w:tcW w:type="dxa" w:w="4422"/>
           </w:tcPr>
           <w:p>
             <w:r>
@@ -513,7 +549,7 @@
         </w:tc>
         <w:tc>
           <w:tcPr>
-            <w:tcW w:type="dxa" w:w="4535"/>
+            <w:tcW w:type="dxa" w:w="4649"/>
           </w:tcPr>
           <w:p>
             <w:r>
@@ -521,7 +557,16 @@
                 <w:b w:val="0"/>
                 <w:color w:val="C00000"/>
               </w:rPr>
-              <w:t>“Offer” takes two objects: offer somebody something. Write “offer students a golden opportunity to gain” — never “offer students to gain”. (Lesson 2, Pattern 1)</w:t>
+              <w:t>(a) Agreement: “work offer” → “work offers”.</w:t>
+            </w:r>
+          </w:p>
+          <w:p>
+            <w:r>
+              <w:rPr>
+                <w:b w:val="0"/>
+                <w:color w:val="C00000"/>
+              </w:rPr>
+              <w:t>(b) Plural: “their future career” → “their future careers” (more than one student). (Lesson 2, Pattern 1)</w:t>
             </w:r>
           </w:p>
         </w:tc>
@@ -543,7 +588,7 @@
         </w:tc>
         <w:tc>
           <w:tcPr>
-            <w:tcW w:type="dxa" w:w="4535"/>
+            <w:tcW w:type="dxa" w:w="4422"/>
           </w:tcPr>
           <w:p>
             <w:r>
@@ -557,7 +602,7 @@
         </w:tc>
         <w:tc>
           <w:tcPr>
-            <w:tcW w:type="dxa" w:w="4535"/>
+            <w:tcW w:type="dxa" w:w="4649"/>
           </w:tcPr>
           <w:p>
             <w:r>
@@ -565,7 +610,16 @@
                 <w:b w:val="0"/>
                 <w:color w:val="C00000"/>
               </w:rPr>
-              <w:t>Participle form. The comment after the comma describes the previous clause, so it must be the –ing participle “paving” — the past participle “paved” has no subject. (Lesson 2, Pattern 1)</w:t>
+              <w:t>(a) Plural: “new peoples” → “new people” (“people” is already plural).</w:t>
+            </w:r>
+          </w:p>
+          <w:p>
+            <w:r>
+              <w:rPr>
+                <w:b w:val="0"/>
+                <w:color w:val="C00000"/>
+              </w:rPr>
+              <w:t>(b) Verb form: “paved” → “paving” (the comment after the comma is a participle phrase, not a second main verb). (Lesson 2, Pattern 1)</w:t>
             </w:r>
           </w:p>
         </w:tc>
@@ -587,7 +641,7 @@
         </w:tc>
         <w:tc>
           <w:tcPr>
-            <w:tcW w:type="dxa" w:w="4535"/>
+            <w:tcW w:type="dxa" w:w="4422"/>
           </w:tcPr>
           <w:p>
             <w:r>
@@ -601,7 +655,7 @@
         </w:tc>
         <w:tc>
           <w:tcPr>
-            <w:tcW w:type="dxa" w:w="4535"/>
+            <w:tcW w:type="dxa" w:w="4649"/>
           </w:tcPr>
           <w:p>
             <w:r>
@@ -609,7 +663,16 @@
                 <w:b w:val="0"/>
                 <w:color w:val="C00000"/>
               </w:rPr>
-              <w:t>Verb form after “which in turn”. The clause needs a finite present-tense verb (“boosts”), not a participle (“boosting”). (Lesson 2, Pattern 2)</w:t>
+              <w:t>(a) Agreement: “timetable allow” → “timetable allows”.</w:t>
+            </w:r>
+          </w:p>
+          <w:p>
+            <w:r>
+              <w:rPr>
+                <w:b w:val="0"/>
+                <w:color w:val="C00000"/>
+              </w:rPr>
+              <w:t>(b) Verb form: “boosting” → “boosts” (the “which in turn” clause needs a finite verb). (Lesson 2, Pattern 2)</w:t>
             </w:r>
           </w:p>
         </w:tc>
@@ -631,7 +694,7 @@
         </w:tc>
         <w:tc>
           <w:tcPr>
-            <w:tcW w:type="dxa" w:w="4535"/>
+            <w:tcW w:type="dxa" w:w="4422"/>
           </w:tcPr>
           <w:p>
             <w:r>
@@ -645,7 +708,7 @@
         </w:tc>
         <w:tc>
           <w:tcPr>
-            <w:tcW w:type="dxa" w:w="4535"/>
+            <w:tcW w:type="dxa" w:w="4649"/>
           </w:tcPr>
           <w:p>
             <w:r>
@@ -653,7 +716,16 @@
                 <w:b w:val="0"/>
                 <w:color w:val="C00000"/>
               </w:rPr>
-              <w:t>The pattern is “a means OF + gerund”. After the preposition “of”, use the –ing form: “of relieving”, not “of relieve”. (Lesson 2, Pattern 3)</w:t>
+              <w:t>(a) Agreement: “sports serves” → “sports serve”.</w:t>
+            </w:r>
+          </w:p>
+          <w:p>
+            <w:r>
+              <w:rPr>
+                <w:b w:val="0"/>
+                <w:color w:val="C00000"/>
+              </w:rPr>
+              <w:t>(b) Verb form: “of relieve” → “of relieving” (after the preposition “of” we need the –ing form). (Lesson 2, Pattern 3)</w:t>
             </w:r>
           </w:p>
         </w:tc>
@@ -675,7 +747,7 @@
         </w:tc>
         <w:tc>
           <w:tcPr>
-            <w:tcW w:type="dxa" w:w="4535"/>
+            <w:tcW w:type="dxa" w:w="4422"/>
           </w:tcPr>
           <w:p>
             <w:r>
@@ -683,13 +755,13 @@
                 <w:b w:val="0"/>
                 <w:color w:val="C00000"/>
               </w:rPr>
-              <w:t>Admittedly, online lessons offer students greater flexibility. Nevertheless, they cannot replace face-to-face interaction, as real-time discussion sparks deeper engagement.</w:t>
+              <w:t>Admittedly, online lessons offer students greater flexibility. Nevertheless, they cannot replace face-to-face interaction, as real-time discussions spark deeper engagement.</w:t>
             </w:r>
           </w:p>
         </w:tc>
         <w:tc>
           <w:tcPr>
-            <w:tcW w:type="dxa" w:w="4535"/>
+            <w:tcW w:type="dxa" w:w="4649"/>
           </w:tcPr>
           <w:p>
             <w:r>
@@ -697,7 +769,16 @@
                 <w:b w:val="0"/>
                 <w:color w:val="C00000"/>
               </w:rPr>
-              <w:t>Comma splice. “Nevertheless” begins a new sentence, so the comma before it must become a full stop (or a semicolon) and “Nevertheless” takes a capital letter. (Lesson 2, Pattern 4)</w:t>
+              <w:t>(a) Punctuation / sentence boundary: the comma before “nevertheless” becomes a full stop and “Nevertheless” takes a capital letter (otherwise it is a comma splice).</w:t>
+            </w:r>
+          </w:p>
+          <w:p>
+            <w:r>
+              <w:rPr>
+                <w:b w:val="0"/>
+                <w:color w:val="C00000"/>
+              </w:rPr>
+              <w:t>(b) Agreement: “discussions sparks” → “discussions spark” (the subject is plural). (Lesson 2, Pattern 4)</w:t>
             </w:r>
           </w:p>
         </w:tc>
@@ -719,7 +800,7 @@
         </w:tc>
         <w:tc>
           <w:tcPr>
-            <w:tcW w:type="dxa" w:w="4535"/>
+            <w:tcW w:type="dxa" w:w="4422"/>
           </w:tcPr>
           <w:p>
             <w:r>
@@ -733,7 +814,7 @@
         </w:tc>
         <w:tc>
           <w:tcPr>
-            <w:tcW w:type="dxa" w:w="4535"/>
+            <w:tcW w:type="dxa" w:w="4649"/>
           </w:tcPr>
           <w:p>
             <w:r>
@@ -741,7 +822,16 @@
                 <w:b w:val="0"/>
                 <w:color w:val="C00000"/>
               </w:rPr>
-              <w:t>Agreement after “which”. “Which” refers to the activity of reading (singular), so the verb is “enables”, not “enable”. (Lesson 2, Pattern 3)</w:t>
+              <w:t>(a) Agreement: “Reading serve” → “Reading serves”.</w:t>
+            </w:r>
+          </w:p>
+          <w:p>
+            <w:r>
+              <w:rPr>
+                <w:b w:val="0"/>
+                <w:color w:val="C00000"/>
+              </w:rPr>
+              <w:t>(b) Article: “the powerful means” → “a powerful means” (the indefinite article goes with this fixed pattern). (Lesson 2, Pattern 3)</w:t>
             </w:r>
           </w:p>
         </w:tc>
@@ -768,7 +858,7 @@
         <w:rPr>
           <w:b w:val="0"/>
         </w:rPr>
-        <w:t>In the paragraph that suggests solutions, most students write “Schools can …”, “The government can …” and “Parents can …”. These sentences are correct, but they are plain: they show the marker what you think, not how well you can write. Part B gives you THREE patterns that upgrade exactly these sentences. Each one is easy to remember, and each one carries one “wow” feature that impresses the marker.</w:t>
+        <w:t>In the paragraph that suggests solutions, most students write “Schools can …”, “The government can …” and “Parents can …”. These sentences are correct, but they are plain: they show the marker what you think, not how well you can write. Part B gives you THREE patterns that upgrade exactly these sentences. Each one is only ONE clause, easy to remember, and each one carries one “wow” feature that impresses the marker.</w:t>
       </w:r>
     </w:p>
     <w:p>
@@ -882,7 +972,7 @@
               <w:rPr>
                 <w:b w:val="0"/>
               </w:rPr>
-              <w:t>It is high time that [doer] [PAST-TENSE verb phrase], so as to [purpose].</w:t>
+              <w:t>It is high time that [doer] [PAST-TENSE verb phrase].</w:t>
             </w:r>
           </w:p>
         </w:tc>
@@ -975,19 +1065,7 @@
               <w:rPr>
                 <w:b w:val="0"/>
               </w:rPr>
-              <w:t xml:space="preserve"> in accessible sports facilities, </w:t>
-            </w:r>
-            <w:r>
-              <w:rPr>
-                <w:b/>
-              </w:rPr>
-              <w:t>so as to</w:t>
-            </w:r>
-            <w:r>
-              <w:rPr>
-                <w:b w:val="0"/>
-              </w:rPr>
-              <w:t xml:space="preserve"> make regular exercise possible for every citizen.</w:t>
+              <w:t xml:space="preserve"> in free, accessible sports facilities in every district.</w:t>
             </w:r>
           </w:p>
         </w:tc>
@@ -1006,7 +1084,7 @@
           <w:b w:val="0"/>
           <w:color w:val="C00000"/>
         </w:rPr>
-        <w:t>“It is high time that” is followed by the PAST tense — invested / launched / reviewed — never the present tense (“invests”). If students panic, the easy alternative is “It is high time for the government TO invest …”. Keep the purpose clause as “so as to + base verb”.</w:t>
+        <w:t>“It is high time that” is followed by the PAST tense — invested / launched / reviewed — never the present tense (“invests”). If students panic, the easy alternative is “It is high time for the government TO invest …”.</w:t>
       </w:r>
     </w:p>
     <w:p>
@@ -1050,7 +1128,7 @@
               <w:rPr>
                 <w:b w:val="0"/>
               </w:rPr>
-              <w:t>To [goal], [doer] should make it a priority to [base verb phrase], thereby [gerund phrase — the result].</w:t>
+              <w:t>To [goal], [doer] should make it a priority to [base verb phrase].</w:t>
             </w:r>
           </w:p>
         </w:tc>
@@ -1143,19 +1221,7 @@
               <w:rPr>
                 <w:b w:val="0"/>
               </w:rPr>
-              <w:t xml:space="preserve"> add a daily exercise break to the timetable, </w:t>
-            </w:r>
-            <w:r>
-              <w:rPr>
-                <w:b/>
-              </w:rPr>
-              <w:t>thereby</w:t>
-            </w:r>
-            <w:r>
-              <w:rPr>
-                <w:b w:val="0"/>
-              </w:rPr>
-              <w:t xml:space="preserve"> nurturing a habit of staying active.</w:t>
+              <w:t xml:space="preserve"> add a daily exercise break to the timetable.</w:t>
             </w:r>
           </w:p>
         </w:tc>
@@ -1174,7 +1240,7 @@
           <w:b w:val="0"/>
           <w:color w:val="C00000"/>
         </w:rPr>
-        <w:t>“make it a priority to” takes the BASE verb (“to add”, never “to adding”). “thereby + –ing” names the result and must follow logically from the action. Opening with “To + goal” replaces the vague “so that” and shows the marker your purpose in the first three words.</w:t>
+        <w:t>“make it a priority to” takes the BASE verb (“to add”, never “to adding”). Opening with “To + goal” replaces the vague “so that” and shows the marker your purpose in the first three words.</w:t>
       </w:r>
     </w:p>
     <w:p>
@@ -1218,7 +1284,7 @@
               <w:rPr>
                 <w:b w:val="0"/>
               </w:rPr>
-              <w:t>[Doer], in collaboration with [second party], should [verb phrase], thus [gerund phrase — the result].</w:t>
+              <w:t>[Doer], in collaboration with [second party], should [verb phrase].</w:t>
             </w:r>
           </w:p>
         </w:tc>
@@ -1299,19 +1365,7 @@
               <w:rPr>
                 <w:b w:val="0"/>
               </w:rPr>
-              <w:t xml:space="preserve"> should set a positive example by exercising with their children at weekends, </w:t>
-            </w:r>
-            <w:r>
-              <w:rPr>
-                <w:b/>
-              </w:rPr>
-              <w:t>thus</w:t>
-            </w:r>
-            <w:r>
-              <w:rPr>
-                <w:b w:val="0"/>
-              </w:rPr>
-              <w:t xml:space="preserve"> fostering a culture of fitness at home.</w:t>
+              <w:t xml:space="preserve"> should encourage their children to adopt a more active lifestyle.</w:t>
             </w:r>
           </w:p>
         </w:tc>
@@ -1330,7 +1384,23 @@
           <w:b w:val="0"/>
           <w:color w:val="C00000"/>
         </w:rPr>
-        <w:t>“in collaboration with” = working together with. It is far stronger than “and” or “also” and shows the marker that you understand shared responsibility. The doer is swappable: “The government, in collaboration with district councils, should …”. “set a positive example by + –ing” adds the means; “thus + –ing” closes with the result.</w:t>
+        <w:t>“in collaboration with” = working together with. It is far stronger than “and” or “also” and shows the marker that you understand shared responsibility. The doer is swappable: “The government, in collaboration with district councils, should …”.</w:t>
+      </w:r>
+    </w:p>
+    <w:p>
+      <w:r>
+        <w:rPr>
+          <w:b/>
+          <w:color w:val="C00000"/>
+        </w:rPr>
+        <w:t xml:space="preserve">Teacher’s note on the design: </w:t>
+      </w:r>
+      <w:r>
+        <w:rPr>
+          <w:b w:val="0"/>
+          <w:color w:val="C00000"/>
+        </w:rPr>
+        <w:t>the three patterns are deliberately kept to ONE clause. Endings of the “, so as to …” / “, thereby + –ing” type were left out this time — level 3 students lose control of the main clause as soon as they open a second one. Add the endings back only when the class can hold the short form.</w:t>
       </w:r>
     </w:p>
     <w:p>
@@ -1652,153 +1722,6 @@
           </w:p>
         </w:tc>
       </w:tr>
-      <w:tr>
-        <w:tc>
-          <w:tcPr>
-            <w:tcW w:type="dxa" w:w="454"/>
-          </w:tcPr>
-          <w:p>
-            <w:r>
-              <w:rPr>
-                <w:b/>
-              </w:rPr>
-              <w:t>6</w:t>
-            </w:r>
-          </w:p>
-        </w:tc>
-        <w:tc>
-          <w:tcPr>
-            <w:tcW w:type="dxa" w:w="3402"/>
-          </w:tcPr>
-          <w:p>
-            <w:r>
-              <w:rPr>
-                <w:b w:val="0"/>
-              </w:rPr>
-              <w:t>make students care about their health</w:t>
-            </w:r>
-          </w:p>
-        </w:tc>
-        <w:tc>
-          <w:tcPr>
-            <w:tcW w:type="dxa" w:w="5783"/>
-          </w:tcPr>
-          <w:p>
-            <w:r>
-              <w:rPr>
-                <w:b/>
-              </w:rPr>
-              <w:t>cultivate healthy habits</w:t>
-            </w:r>
-          </w:p>
-          <w:p>
-            <w:r>
-              <w:rPr>
-                <w:i/>
-              </w:rPr>
-              <w:t>e.g. Schools can cultivate healthy habits before bad ones take root.</w:t>
-            </w:r>
-          </w:p>
-        </w:tc>
-      </w:tr>
-      <w:tr>
-        <w:tc>
-          <w:tcPr>
-            <w:tcW w:type="dxa" w:w="454"/>
-          </w:tcPr>
-          <w:p>
-            <w:r>
-              <w:rPr>
-                <w:b/>
-              </w:rPr>
-              <w:t>7</w:t>
-            </w:r>
-          </w:p>
-        </w:tc>
-        <w:tc>
-          <w:tcPr>
-            <w:tcW w:type="dxa" w:w="3402"/>
-          </w:tcPr>
-          <w:p>
-            <w:r>
-              <w:rPr>
-                <w:b w:val="0"/>
-              </w:rPr>
-              <w:t>help people keep fit</w:t>
-            </w:r>
-          </w:p>
-        </w:tc>
-        <w:tc>
-          <w:tcPr>
-            <w:tcW w:type="dxa" w:w="5783"/>
-          </w:tcPr>
-          <w:p>
-            <w:r>
-              <w:rPr>
-                <w:b/>
-              </w:rPr>
-              <w:t>enable citizens to keep fit</w:t>
-            </w:r>
-          </w:p>
-          <w:p>
-            <w:r>
-              <w:rPr>
-                <w:i/>
-              </w:rPr>
-              <w:t>e.g. Free fitness classes enable citizens to keep fit regardless of income.</w:t>
-            </w:r>
-          </w:p>
-        </w:tc>
-      </w:tr>
-      <w:tr>
-        <w:tc>
-          <w:tcPr>
-            <w:tcW w:type="dxa" w:w="454"/>
-          </w:tcPr>
-          <w:p>
-            <w:r>
-              <w:rPr>
-                <w:b/>
-              </w:rPr>
-              <w:t>8</w:t>
-            </w:r>
-          </w:p>
-        </w:tc>
-        <w:tc>
-          <w:tcPr>
-            <w:tcW w:type="dxa" w:w="3402"/>
-          </w:tcPr>
-          <w:p>
-            <w:r>
-              <w:rPr>
-                <w:b w:val="0"/>
-              </w:rPr>
-              <w:t>fewer people do exercise now</w:t>
-            </w:r>
-          </w:p>
-        </w:tc>
-        <w:tc>
-          <w:tcPr>
-            <w:tcW w:type="dxa" w:w="5783"/>
-          </w:tcPr>
-          <w:p>
-            <w:r>
-              <w:rPr>
-                <w:b/>
-              </w:rPr>
-              <w:t>physical inactivity has become alarmingly common</w:t>
-            </w:r>
-          </w:p>
-          <w:p>
-            <w:r>
-              <w:rPr>
-                <w:i/>
-              </w:rPr>
-              <w:t>e.g. Physical inactivity has become alarmingly common among young office workers.</w:t>
-            </w:r>
-          </w:p>
-        </w:tc>
-      </w:tr>
     </w:tbl>
     <w:p>
       <w:pPr>
@@ -1821,7 +1744,7 @@
         <w:rPr>
           <w:b w:val="0"/>
         </w:rPr>
-        <w:t>Upgrade each simple sentence with the pattern shown. The topics are different from the fitness topic in Part B. Sets 4–6 are more challenging: you must join the TWO simple sentences into ONE upgraded sentence.</w:t>
+        <w:t>Upgrade each simple sentence with the pattern shown, and keep the pattern to ONE clause, as taught in Part B. The topics are different from the fitness topic in Part B. Sets 4–6 are more challenging: you must join the TWO simple sentences into ONE upgraded sentence.</w:t>
       </w:r>
     </w:p>
     <w:p>
@@ -1900,7 +1823,7 @@
                 <w:b/>
                 <w:color w:val="C00000"/>
               </w:rPr>
-              <w:t>It is high time that the government raised teenagers’ awareness of the importance of sleep, so as to reverse the worrying trend of sleep deprivation among the young.</w:t>
+              <w:t>It is high time that the government raised teenagers’ awareness of the importance of sleep.</w:t>
             </w:r>
           </w:p>
         </w:tc>
@@ -1922,7 +1845,7 @@
           <w:b w:val="0"/>
           <w:color w:val="C00000"/>
         </w:rPr>
-        <w:t>Accept any answer that keeps the formula and the logic — e.g. “launched a campaign to promote healthy sleeping habits, so as to …”.</w:t>
+        <w:t>Accept any past-tense verb phrase: “launched a campaign on healthy sleeping habits”, “made sleep education part of the junior curriculum”.</w:t>
       </w:r>
     </w:p>
     <w:p>
@@ -2001,7 +1924,7 @@
                 <w:b/>
                 <w:color w:val="C00000"/>
               </w:rPr>
-              <w:t>To cut food waste on campus, schools should make it a priority to offer smaller portions and free second helpings, thereby encouraging students to take only what they can finish.</w:t>
+              <w:t>To cut food waste on campus, schools should make it a priority to offer smaller portions and free second helpings.</w:t>
             </w:r>
           </w:p>
         </w:tc>
@@ -2023,7 +1946,7 @@
           <w:b w:val="0"/>
           <w:color w:val="C00000"/>
         </w:rPr>
-        <w:t>Accept “To reduce food waste …” and any result clause that follows logically (“thereby cutting the amount of food sent to landfill”).</w:t>
+        <w:t>Accept “To reduce food waste …” and any sensible verb phrase after “make it a priority to”.</w:t>
       </w:r>
     </w:p>
     <w:p>
@@ -2102,7 +2025,7 @@
                 <w:b/>
                 <w:color w:val="C00000"/>
               </w:rPr>
-              <w:t>Parents, in collaboration with schools, should talk openly with their children about cyberbullying, thus building the trust that encourages victims to speak up.</w:t>
+              <w:t>Parents, in collaboration with schools, should discuss online safety openly with their children.</w:t>
             </w:r>
           </w:p>
         </w:tc>
@@ -2124,7 +2047,7 @@
           <w:b w:val="0"/>
           <w:color w:val="C00000"/>
         </w:rPr>
-        <w:t>Accept any sensible second party (the school, social workers) and any result clause that follows logically (“thus creating a safe space where problems can be reported”).</w:t>
+        <w:t>Accept any sensible second party (the school, social workers) and any formal verb phrase (“set clear rules about online behaviour at home”).</w:t>
       </w:r>
     </w:p>
     <w:p>
@@ -2174,7 +2097,7 @@
               <w:rPr>
                 <w:b w:val="0"/>
               </w:rPr>
-              <w:t>The government can spend more money on youth mental health services.</w:t>
+              <w:t>The government can spend more money on mental health services.</w:t>
             </w:r>
           </w:p>
         </w:tc>
@@ -2201,7 +2124,7 @@
               <w:rPr>
                 <w:b w:val="0"/>
               </w:rPr>
-              <w:t>Schools can also teach students how to manage stress.</w:t>
+              <w:t>Young people need these services at school.</w:t>
             </w:r>
           </w:p>
         </w:tc>
@@ -2230,7 +2153,7 @@
                 <w:b/>
                 <w:color w:val="C00000"/>
               </w:rPr>
-              <w:t>It is high time that the government invested more in youth mental health services, so as to ensure that schools can teach students how to manage stress.</w:t>
+              <w:t>It is high time that the government invested more in school-based mental health services for young people.</w:t>
             </w:r>
           </w:p>
         </w:tc>
@@ -2252,7 +2175,7 @@
           <w:b w:val="0"/>
           <w:color w:val="C00000"/>
         </w:rPr>
-        <w:t>Require BOTH ideas in ONE sentence. Also accept “… so as to make stress-management lessons possible in every school.”</w:t>
+        <w:t>Idea 2 is folded into the modifier “school-based”, so the pattern stays one clean clause. Also accept “… invested more in mental health services in schools.”</w:t>
       </w:r>
     </w:p>
     <w:p>
@@ -2329,7 +2252,7 @@
               <w:rPr>
                 <w:b w:val="0"/>
               </w:rPr>
-              <w:t>Students will then read more.</w:t>
+              <w:t>Students need a quiet place to read.</w:t>
             </w:r>
           </w:p>
         </w:tc>
@@ -2358,7 +2281,7 @@
                 <w:b/>
                 <w:color w:val="C00000"/>
               </w:rPr>
-              <w:t>To revive students’ interest in reading, schools should make it a priority to keep the library open after school, thereby giving students a quiet place to read every day.</w:t>
+              <w:t>To give students a quiet place to read, schools should make it a priority to keep the library open after school.</w:t>
             </w:r>
           </w:p>
         </w:tc>
@@ -2380,7 +2303,7 @@
           <w:b w:val="0"/>
           <w:color w:val="C00000"/>
         </w:rPr>
-        <w:t>Require the goal at the front and the result after “thereby”. A plain second sentence (“…. Students will then read more.”) scores nothing.</w:t>
+        <w:t>Idea 2 becomes the fronted goal; the second plain sentence must disappear into the pattern.</w:t>
       </w:r>
     </w:p>
     <w:p>
@@ -2430,7 +2353,7 @@
               <w:rPr>
                 <w:b w:val="0"/>
               </w:rPr>
-              <w:t>Teenagers can visit elderly neighbours with community centres.</w:t>
+              <w:t>Teenagers can visit elderly neighbours who live alone.</w:t>
             </w:r>
           </w:p>
         </w:tc>
@@ -2457,7 +2380,7 @@
               <w:rPr>
                 <w:b w:val="0"/>
               </w:rPr>
-              <w:t>The elderly will feel less lonely.</w:t>
+              <w:t>Community centres can arrange these visits.</w:t>
             </w:r>
           </w:p>
         </w:tc>
@@ -2486,7 +2409,7 @@
                 <w:b/>
                 <w:color w:val="C00000"/>
               </w:rPr>
-              <w:t>Teenagers, in collaboration with community centres, should organise regular visits to elderly neighbours, thus easing the loneliness that many of them face.</w:t>
+              <w:t>Teenagers, in collaboration with community centres, should organise regular visits to elderly neighbours who live alone.</w:t>
             </w:r>
           </w:p>
         </w:tc>
@@ -2508,7 +2431,7 @@
           <w:b w:val="0"/>
           <w:color w:val="C00000"/>
         </w:rPr>
-        <w:t>Watch the plural: “the elderly” is already plural — never “the elderlies”. Accept any result clause that follows logically from the visits.</w:t>
+        <w:t>Idea 2 becomes the second party after “in collaboration with”. Watch the plural: “the elderly” is already plural — never “the elderlies”.</w:t>
       </w:r>
     </w:p>
     <w:p>
@@ -2572,50 +2495,50 @@
     </w:p>
     <w:p>
       <w:pPr>
-        <w:spacing w:after="40"/>
+        <w:spacing w:after="0"/>
         <w:ind w:left="227"/>
       </w:pPr>
       <w:r>
         <w:rPr>
           <w:b w:val="0"/>
         </w:rPr>
-        <w:t>Write a letter of about 250 words.</w:t>
+        <w:t>Write ONE body paragraph (about 120 words) for this letter — not the whole letter.</w:t>
       </w:r>
     </w:p>
     <w:p>
       <w:pPr>
-        <w:spacing w:after="40"/>
+        <w:spacing w:after="0"/>
         <w:ind w:left="227"/>
       </w:pPr>
       <w:r>
         <w:rPr>
           <w:b w:val="0"/>
         </w:rPr>
-        <w:t>Use at least TWO of today’s three patterns, and underline every target structure you use.</w:t>
+        <w:t>State your view on the proposal, give at least one reason and at least one suggestion.</w:t>
       </w:r>
     </w:p>
     <w:p>
       <w:pPr>
-        <w:spacing w:after="40"/>
+        <w:spacing w:after="0"/>
         <w:ind w:left="227"/>
       </w:pPr>
       <w:r>
         <w:rPr>
           <w:b w:val="0"/>
         </w:rPr>
-        <w:t>Use the letter format: “Dear Principal,” at the start; “Yours sincerely,” and your name and class at the end.</w:t>
+        <w:t>Use at least TWO of today’s three patterns and underline every target structure you use.</w:t>
       </w:r>
     </w:p>
     <w:p>
       <w:pPr>
-        <w:spacing w:after="40"/>
+        <w:spacing w:after="0"/>
         <w:ind w:left="227"/>
       </w:pPr>
       <w:r>
         <w:rPr>
           <w:b w:val="0"/>
         </w:rPr>
-        <w:t>Decide your stance first: you may oppose the change, or support it on one condition.</w:t>
+        <w:t>Follow the Lesson 2 chain: [Topic sentence] → [Explain] → [Example] → [Back to main idea].</w:t>
       </w:r>
     </w:p>
     <w:p>
@@ -2625,146 +2548,8 @@
       <w:r>
         <w:rPr>
           <w:b/>
-          <w:color w:val="C00000"/>
         </w:rPr>
-        <w:t>Teacher’s planning guide</w:t>
-      </w:r>
-    </w:p>
-    <w:tbl>
-      <w:tblPr>
-        <w:tblStyle w:val="TableGrid"/>
-        <w:tblW w:type="auto" w:w="0"/>
-        <w:jc w:val="left"/>
-        <w:tblLayout w:type="fixed"/>
-        <w:tblLook w:firstColumn="1" w:firstRow="1" w:lastColumn="0" w:lastRow="0" w:noHBand="0" w:noVBand="1" w:val="04A0"/>
-        <w:tblLayout w:type="fixed"/>
-      </w:tblPr>
-      <w:tblGrid>
-        <w:gridCol w:w="4819"/>
-        <w:gridCol w:w="4819"/>
-      </w:tblGrid>
-      <w:tr>
-        <w:tc>
-          <w:tcPr>
-            <w:tcW w:type="dxa" w:w="1548"/>
-          </w:tcPr>
-          <w:p>
-            <w:r>
-              <w:rPr>
-                <w:b/>
-              </w:rPr>
-              <w:t>Introduction</w:t>
-            </w:r>
-          </w:p>
-        </w:tc>
-        <w:tc>
-          <w:tcPr>
-            <w:tcW w:type="dxa" w:w="8090"/>
-          </w:tcPr>
-          <w:p>
-            <w:r>
-              <w:rPr>
-                <w:b w:val="0"/>
-              </w:rPr>
-              <w:t>The issue + your stance. Use a Lesson 1 pattern (e.g. “In recent times, the issue of … has sparked widespread concern across society.”).</w:t>
-            </w:r>
-          </w:p>
-        </w:tc>
-      </w:tr>
-      <w:tr>
-        <w:tc>
-          <w:tcPr>
-            <w:tcW w:type="dxa" w:w="1548"/>
-          </w:tcPr>
-          <w:p>
-            <w:r>
-              <w:rPr>
-                <w:b/>
-              </w:rPr>
-              <w:t>Body 1</w:t>
-            </w:r>
-          </w:p>
-        </w:tc>
-        <w:tc>
-          <w:tcPr>
-            <w:tcW w:type="dxa" w:w="8090"/>
-          </w:tcPr>
-          <w:p>
-            <w:r>
-              <w:rPr>
-                <w:b w:val="0"/>
-              </w:rPr>
-              <w:t>Why the PE lesson matters. A Lesson 2 pattern fits here (“… offers students a golden opportunity to …, paving the way for …”), followed by an Admittedly / Nevertheless counter-argument.</w:t>
-            </w:r>
-          </w:p>
-        </w:tc>
-      </w:tr>
-      <w:tr>
-        <w:tc>
-          <w:tcPr>
-            <w:tcW w:type="dxa" w:w="1548"/>
-          </w:tcPr>
-          <w:p>
-            <w:r>
-              <w:rPr>
-                <w:b/>
-              </w:rPr>
-              <w:t>Body 2</w:t>
-            </w:r>
-          </w:p>
-        </w:tc>
-        <w:tc>
-          <w:tcPr>
-            <w:tcW w:type="dxa" w:w="8090"/>
-          </w:tcPr>
-          <w:p>
-            <w:r>
-              <w:rPr>
-                <w:b w:val="0"/>
-              </w:rPr>
-              <w:t>Your alternative solution — this is where today’s three patterns do the work. Give the school something it can actually do.</w:t>
-            </w:r>
-          </w:p>
-        </w:tc>
-      </w:tr>
-      <w:tr>
-        <w:tc>
-          <w:tcPr>
-            <w:tcW w:type="dxa" w:w="1548"/>
-          </w:tcPr>
-          <w:p>
-            <w:r>
-              <w:rPr>
-                <w:b/>
-              </w:rPr>
-              <w:t>Conclusion</w:t>
-            </w:r>
-          </w:p>
-        </w:tc>
-        <w:tc>
-          <w:tcPr>
-            <w:tcW w:type="dxa" w:w="8090"/>
-          </w:tcPr>
-          <w:p>
-            <w:r>
-              <w:rPr>
-                <w:b w:val="0"/>
-              </w:rPr>
-              <w:t>One sentence of recommendation, no new ideas.</w:t>
-            </w:r>
-          </w:p>
-        </w:tc>
-      </w:tr>
-    </w:tbl>
-    <w:p>
-      <w:pPr>
-        <w:spacing w:before="200" w:after="80"/>
-      </w:pPr>
-      <w:r>
-        <w:rPr>
-          <w:b/>
-        </w:rPr>
-        <w:t>Teacher’s model answer (opposing the change, 239 words)</w:t>
+        <w:t>Teacher’s model answer (one paragraph, 129 words)</w:t>
       </w:r>
     </w:p>
     <w:p>
@@ -2775,14 +2560,14 @@
         <w:rPr>
           <w:b w:val="0"/>
         </w:rPr>
-        <w:t>Dear Principal,</w:t>
+        <w:t>Although an extra period for examination preparation sounds attractive, cutting one of our two weekly PE lessons would do F.6 students more harm than good.</w:t>
       </w:r>
       <w:r>
         <w:rPr>
           <w:b w:val="0"/>
           <w:color w:val="C00000"/>
         </w:rPr>
-        <w:t xml:space="preserve">  [Salutation]</w:t>
+        <w:t xml:space="preserve">  [Topic sentence — states the stance]</w:t>
       </w:r>
     </w:p>
     <w:p>
@@ -2793,14 +2578,14 @@
         <w:rPr>
           <w:b w:val="0"/>
         </w:rPr>
-        <w:t>In recent times, the issue of students’ physical well-being has sparked widespread concern across society. I am writing to express my opposition to the proposal of cutting one of our two weekly PE lessons in favour of an extra examination preparation period.</w:t>
+        <w:t>To keep us physically fit during the examination year, the school should make it a priority to protect both lessons and to improve what happens in them.</w:t>
       </w:r>
       <w:r>
         <w:rPr>
           <w:b w:val="0"/>
           <w:color w:val="C00000"/>
         </w:rPr>
-        <w:t xml:space="preserve">  [Introduction — Lesson 1, Pattern 3 + stance]</w:t>
+        <w:t xml:space="preserve">  [Suggestion 1 — today’s Pattern 2]</w:t>
       </w:r>
     </w:p>
     <w:p>
@@ -2811,14 +2596,14 @@
         <w:rPr>
           <w:b w:val="0"/>
         </w:rPr>
-        <w:t>Undoubtedly, F.6 students would welcome more time for revision. Nevertheless, PE lessons offer us a golden opportunity to recharge after long hours of study, paving the way for sharper concentration in class. Admittedly, an extra period of examination practice sounds attractive. Nevertheless, replacing physical activity with yet more revision is short-sighted, as a tired mind absorbs far less than a refreshed one.</w:t>
+        <w:t>A single game of badminton or basketball clears the mind far more effectively than another hour of past papers, and the concentration we gain is worth the time we spend.</w:t>
       </w:r>
       <w:r>
         <w:rPr>
           <w:b w:val="0"/>
           <w:color w:val="C00000"/>
         </w:rPr>
-        <w:t xml:space="preserve">  [Body 1 — Lesson 2, Pattern 1 + Pattern 4 (concede, then rebut)]</w:t>
+        <w:t xml:space="preserve">  [Explain + Example]</w:t>
       </w:r>
     </w:p>
     <w:p>
@@ -2829,14 +2614,14 @@
         <w:rPr>
           <w:b w:val="0"/>
         </w:rPr>
-        <w:t>Instead of sacrificing our PE lesson, may I propose two practical alternatives? To free up time for examination preparation, the school should make it a priority to shorten the morning assembly and the daily roll-call, thereby recovering a full period every week. It is also high time that the school reviewed the examination timetable, so as to spread the pressure of mock papers more evenly across the year. Parents, in collaboration with the school, should also encourage their children to spend half an hour on simple exercise at home, thus turning fitness into a daily habit rather than a single weekly lesson.</w:t>
+        <w:t>It is also high time that the school looked for the extra period somewhere else, such as the morning assembly, rather than taking it from the only lesson that keeps us moving.</w:t>
       </w:r>
       <w:r>
         <w:rPr>
           <w:b w:val="0"/>
           <w:color w:val="C00000"/>
         </w:rPr>
-        <w:t xml:space="preserve">  [Body 2 — today’s Patterns 2, 1 and 3 in one paragraph]</w:t>
+        <w:t xml:space="preserve">  [Suggestion 2 — today’s Pattern 1]</w:t>
       </w:r>
     </w:p>
     <w:p>
@@ -2847,155 +2632,14 @@
         <w:rPr>
           <w:b w:val="0"/>
         </w:rPr>
-        <w:t>Physical fitness and academic performance are not rivals. Please reconsider this proposal, so that F.6 students can prepare for the public examination without damaging their health.</w:t>
+        <w:t>I hope the Principal will reconsider the proposal before our health pays for our grades.</w:t>
       </w:r>
       <w:r>
         <w:rPr>
           <w:b w:val="0"/>
           <w:color w:val="C00000"/>
         </w:rPr>
-        <w:t xml:space="preserve">  [Conclusion — recommendation]</w:t>
-      </w:r>
-    </w:p>
-    <w:p>
-      <w:pPr>
-        <w:spacing w:after="120"/>
-      </w:pPr>
-      <w:r>
-        <w:rPr>
-          <w:b w:val="0"/>
-        </w:rPr>
-        <w:t>Yours sincerely,</w:t>
-        <w:br/>
-        <w:t>Chris Wong (6B)</w:t>
-      </w:r>
-      <w:r>
-        <w:rPr>
-          <w:b w:val="0"/>
-          <w:color w:val="C00000"/>
-        </w:rPr>
-        <w:t xml:space="preserve">  [Closing]</w:t>
-      </w:r>
-    </w:p>
-    <w:p>
-      <w:pPr>
-        <w:spacing w:before="200" w:after="80"/>
-      </w:pPr>
-      <w:r>
-        <w:rPr>
-          <w:b/>
-        </w:rPr>
-        <w:t>Teacher’s model answer B (supporting the change, on one condition — 213 words)</w:t>
-      </w:r>
-    </w:p>
-    <w:p>
-      <w:pPr>
-        <w:spacing w:after="120"/>
-      </w:pPr>
-      <w:r>
-        <w:rPr>
-          <w:b w:val="0"/>
-        </w:rPr>
-        <w:t>Dear Principal,</w:t>
-      </w:r>
-      <w:r>
-        <w:rPr>
-          <w:b w:val="0"/>
-          <w:color w:val="C00000"/>
-        </w:rPr>
-        <w:t xml:space="preserve">  [Salutation]</w:t>
-      </w:r>
-    </w:p>
-    <w:p>
-      <w:pPr>
-        <w:spacing w:after="120"/>
-      </w:pPr>
-      <w:r>
-        <w:rPr>
-          <w:b w:val="0"/>
-        </w:rPr>
-        <w:t>In recent times, the issue of examination pressure on F.6 students has sparked widespread concern across society. I am writing to support the proposal, on the condition that the school protects our health at the same time.</w:t>
-      </w:r>
-      <w:r>
-        <w:rPr>
-          <w:b w:val="0"/>
-          <w:color w:val="C00000"/>
-        </w:rPr>
-        <w:t xml:space="preserve">  [Introduction — Lesson 1, Pattern 3 + stance]</w:t>
-      </w:r>
-    </w:p>
-    <w:p>
-      <w:pPr>
-        <w:spacing w:after="120"/>
-      </w:pPr>
-      <w:r>
-        <w:rPr>
-          <w:b w:val="0"/>
-        </w:rPr>
-        <w:t>Admittedly, cutting a PE lesson reduces the time we spend exercising. Nevertheless, the final year of study demands every minute of preparation, as the competition for university places has never been keener. From the perspective of F.6 students, an extra examination preparation period allows us to practise past papers under a teacher’s supervision, which in turn reduces the anxiety of revising alone at home.</w:t>
-      </w:r>
-      <w:r>
-        <w:rPr>
-          <w:b w:val="0"/>
-          <w:color w:val="C00000"/>
-        </w:rPr>
-        <w:t xml:space="preserve">  [Body 1 — Lesson 2, Pattern 4 + Pattern 2]</w:t>
-      </w:r>
-    </w:p>
-    <w:p>
-      <w:pPr>
-        <w:spacing w:after="120"/>
-      </w:pPr>
-      <w:r>
-        <w:rPr>
-          <w:b w:val="0"/>
-        </w:rPr>
-        <w:t>To make up for the lost lesson, it is high time that the school offered a supervised morning workout before classes, so as to keep our bodies active without touching the teaching timetable. Teachers should also make it a priority to set homework that leaves room for exercise, thereby preventing revision from swallowing the whole day, and parents, in collaboration with the school, should monitor our daily routine, thus ensuring that an extra study period does not become an extra hour in front of a screen.</w:t>
-      </w:r>
-      <w:r>
-        <w:rPr>
-          <w:b w:val="0"/>
-          <w:color w:val="C00000"/>
-        </w:rPr>
-        <w:t xml:space="preserve">  [Body 2 — today’s Patterns 1, 2 and 3 in one paragraph]</w:t>
-      </w:r>
-    </w:p>
-    <w:p>
-      <w:pPr>
-        <w:spacing w:after="120"/>
-      </w:pPr>
-      <w:r>
-        <w:rPr>
-          <w:b w:val="0"/>
-        </w:rPr>
-        <w:t>I hope the school will consider this compromise, which serves the examination and our health at the same time.</w:t>
-      </w:r>
-      <w:r>
-        <w:rPr>
-          <w:b w:val="0"/>
-          <w:color w:val="C00000"/>
-        </w:rPr>
-        <w:t xml:space="preserve">  [Conclusion — recommendation]</w:t>
-      </w:r>
-    </w:p>
-    <w:p>
-      <w:pPr>
-        <w:spacing w:after="120"/>
-      </w:pPr>
-      <w:r>
-        <w:rPr>
-          <w:b w:val="0"/>
-        </w:rPr>
-        <w:t>Yours sincerely,</w:t>
-        <w:br/>
-        <w:t>Chris Wong (6B)</w:t>
-      </w:r>
-      <w:r>
-        <w:rPr>
-          <w:b w:val="0"/>
-          <w:color w:val="C00000"/>
-        </w:rPr>
-        <w:t xml:space="preserve">  [Closing]</w:t>
+        <w:t xml:space="preserve">  [Back to main idea — Link]</w:t>
       </w:r>
     </w:p>
     <w:p>
@@ -3012,38 +2656,38 @@
     </w:p>
     <w:p>
       <w:pPr>
-        <w:spacing w:after="40"/>
+        <w:spacing w:after="0"/>
         <w:ind w:left="227"/>
       </w:pPr>
       <w:r>
         <w:rPr>
           <w:b w:val="0"/>
         </w:rPr>
-        <w:t>Content: a clear stance on the cut itself, plus at least one concrete, realistic alternative (timetable adjustment, morning workout) — not just “PE is good for us”.</w:t>
+        <w:t>Content: a clear stance on the cut itself, plus one realistic alternative — not just “PE is good for us”.</w:t>
       </w:r>
     </w:p>
     <w:p>
       <w:pPr>
-        <w:spacing w:after="40"/>
+        <w:spacing w:after="0"/>
         <w:ind w:left="227"/>
       </w:pPr>
       <w:r>
         <w:rPr>
           <w:b w:val="0"/>
         </w:rPr>
-        <w:t>Language: the target structures used accurately; formal verbs instead of “help” and “make” (establish, invest in, cultivate, combat); no “I think it is good / bad”.</w:t>
+        <w:t>Language: the target patterns used accurately; formal verbs (protect, invest in, combat) rather than “help”; no “I think it is good / bad”.</w:t>
       </w:r>
     </w:p>
     <w:p>
       <w:pPr>
-        <w:spacing w:after="40"/>
+        <w:spacing w:after="0"/>
         <w:ind w:left="227"/>
       </w:pPr>
       <w:r>
         <w:rPr>
           <w:b w:val="0"/>
         </w:rPr>
-        <w:t>Organisation: letter format complete (Dear Principal / Yours sincerely / name and class), one main idea per paragraph, and linkers between paragraphs.</w:t>
+        <w:t>Organisation: topic sentence first, then explain and exemplify, and a closing sentence that returns to the proposal.</w:t>
       </w:r>
     </w:p>
     <w:p>
@@ -3060,7 +2704,7 @@
     </w:p>
     <w:p>
       <w:pPr>
-        <w:spacing w:after="40"/>
+        <w:spacing w:after="0"/>
         <w:ind w:left="227"/>
       </w:pPr>
       <w:r>
@@ -3072,7 +2716,7 @@
     </w:p>
     <w:p>
       <w:pPr>
-        <w:spacing w:after="40"/>
+        <w:spacing w:after="0"/>
         <w:ind w:left="227"/>
       </w:pPr>
       <w:r>
@@ -3084,43 +2728,31 @@
     </w:p>
     <w:p>
       <w:pPr>
-        <w:spacing w:after="40"/>
+        <w:spacing w:after="0"/>
         <w:ind w:left="227"/>
       </w:pPr>
       <w:r>
         <w:rPr>
           <w:b w:val="0"/>
         </w:rPr>
-        <w:t>“thus / thereby + verb” → the –ing form is needed (“thus fostering”, “thereby nurturing”).</w:t>
+        <w:t>“in collaboration with” used as a verb (“parents collaborate with schools should…”) → keep it as a phrase between the subject and the modal.</w:t>
       </w:r>
     </w:p>
     <w:p>
       <w:pPr>
-        <w:spacing w:after="40"/>
+        <w:spacing w:after="0"/>
         <w:ind w:left="227"/>
       </w:pPr>
       <w:r>
         <w:rPr>
           <w:b w:val="0"/>
         </w:rPr>
-        <w:t>“so as to + –ing” → base verb (“so as to make”).</w:t>
+        <w:t>Sentence boundaries: a participle phrase after a comma with no matching subject (“Living in a fast-paced society, academic pressure …”), or a new sentence after a comma (“… flexibility, nevertheless, they cannot …”) → full stop and a capital letter.</w:t>
       </w:r>
     </w:p>
     <w:p>
       <w:pPr>
-        <w:spacing w:after="40"/>
-        <w:ind w:left="227"/>
-      </w:pPr>
-      <w:r>
-        <w:rPr>
-          <w:b w:val="0"/>
-        </w:rPr>
-        <w:t>“in collaboration with” used as a verb (“parents collaborate with schools should…”) → keep it as a phrase between the subject and “should”.</w:t>
-      </w:r>
-    </w:p>
-    <w:p>
-      <w:pPr>
-        <w:spacing w:after="40"/>
+        <w:spacing w:after="0"/>
         <w:ind w:left="227"/>
       </w:pPr>
       <w:r>

</xml_diff>

<commit_message>
Rev 3: fresh proofreading sentences (Lesson 1/2 patterns, new content) with verb-form and part-of-speech errors
</commit_message>
<xml_diff>
--- a/6B Grammar Lesson 3 - Discussing Solutions (Teacher's).docx
+++ b/6B Grammar Lesson 3 - Discussing Solutions (Teacher's).docx
@@ -69,7 +69,7 @@
         <w:rPr>
           <w:b w:val="0"/>
         </w:rPr>
-        <w:t>Each sentence below contains TWO errors in the sentence patterns you learnt in Lesson 1 (introductions) and Lesson 2 (argument topic sentences). The errors are the common ones: agreement, tense, parts of speech, plurals and articles. Find both errors and write the corrected sentence.</w:t>
+        <w:t>Each sentence below uses one of the patterns you learnt in Lesson 1 (introductions) or Lesson 2 (argument topic sentences), but the content is new. Each sentence contains TWO errors. The errors are the common ones — agreement, tense, verb forms, parts of speech, plurals and articles — and most of them interrupt the structure of the sentence, so read the whole sentence before you correct it.</w:t>
       </w:r>
     </w:p>
     <w:tbl>
@@ -100,7 +100,7 @@
               <w:rPr>
                 <w:b w:val="0"/>
               </w:rPr>
-              <w:t>In recent years, social media has became indispensable part of daily life for young people.</w:t>
+              <w:t>In recent years, food delivery apps have became an indispensably part of daily life for busy office workers.</w:t>
             </w:r>
           </w:p>
           <w:p>
@@ -114,7 +114,7 @@
               <w:rPr>
                 <w:b w:val="0"/>
               </w:rPr>
-              <w:t>Living in a fast-paced society, students are constant exposed to academic stresses.</w:t>
+              <w:t>Living in a fast-paced society, commuters is constantly exposed to noise pollutions.</w:t>
             </w:r>
           </w:p>
           <w:p>
@@ -128,7 +128,7 @@
               <w:rPr>
                 <w:b w:val="0"/>
               </w:rPr>
-              <w:t>In recent times, issue of plastic pollution have sparked widespread concern across society.</w:t>
+              <w:t>In recent times, the issue of the ageing population has spark widespread concern across the society.</w:t>
             </w:r>
           </w:p>
           <w:p>
@@ -142,7 +142,7 @@
               <w:rPr>
                 <w:b w:val="0"/>
               </w:rPr>
-              <w:t>It is undeniable that sleep play a pivotal role in shape students’ memory and concentration.</w:t>
+              <w:t>It is undeniable that early childhood education play a pivotal role in shape children’s characters.</w:t>
             </w:r>
           </w:p>
           <w:p>
@@ -156,7 +156,7 @@
               <w:rPr>
                 <w:b w:val="0"/>
               </w:rPr>
-              <w:t>To begin with, part-time work offer students a golden opportunity to gain real-world experience, paving the way for their future career.</w:t>
+              <w:t>To begin with, cultural exchange programmes offers students a golden opportunity to broaden their horizon, paving the way for a global career.</w:t>
             </w:r>
           </w:p>
           <w:p>
@@ -170,7 +170,7 @@
               <w:rPr>
                 <w:b w:val="0"/>
               </w:rPr>
-              <w:t>To begin with, volunteering offers teenagers a golden opportunity to meet new peoples, paved the way for a wider social circle.</w:t>
+              <w:t>To begin with, joining the school choir offers teenagers a golden opportunity to make new friends, paved the way for a more confidently attitude to school life.</w:t>
             </w:r>
           </w:p>
           <w:p>
@@ -184,7 +184,7 @@
               <w:rPr>
                 <w:b w:val="0"/>
               </w:rPr>
-              <w:t>From the perspective of students, a balanced timetable allow them to manage their time wisely, which in turn boosting their academic performance.</w:t>
+              <w:t>From the perspective of parents, school counselling services allows them to understand their children better, which in turn strengthen family relationships.</w:t>
             </w:r>
           </w:p>
           <w:p>
@@ -198,7 +198,7 @@
               <w:rPr>
                 <w:b w:val="0"/>
               </w:rPr>
-              <w:t>Team sports serves as a powerful means of relieve stress, which enables students to recharge both physically and mentally.</w:t>
+              <w:t>School libraries serves as a powerful means of encourage students to read, which enables them to become lifelong learners.</w:t>
             </w:r>
           </w:p>
           <w:p>
@@ -212,7 +212,7 @@
               <w:rPr>
                 <w:b w:val="0"/>
               </w:rPr>
-              <w:t>Admittedly, online lessons offer students greater flexibility, nevertheless, they cannot replace face-to-face interaction, as real-time discussions sparks deeper engagement.</w:t>
+              <w:t>Admittedly, e-books are more convenient, nevertheless, printed books remain irreplaceable, as reading on paper help readers to concentrate better.</w:t>
             </w:r>
           </w:p>
           <w:p>
@@ -226,7 +226,7 @@
               <w:rPr>
                 <w:b w:val="0"/>
               </w:rPr>
-              <w:t>Reading serve as the powerful means of broadening students’ horizons, which enables them to understand the world beyond the classroom.</w:t>
+              <w:t>It is undeniable that a balanced diet play a pivot role in maintaining students’ health.</w:t>
             </w:r>
           </w:p>
         </w:tc>
@@ -331,7 +331,7 @@
                 <w:b w:val="0"/>
                 <w:color w:val="C00000"/>
               </w:rPr>
-              <w:t>In recent years, social media has become an indispensable part of daily life for young people.</w:t>
+              <w:t>In recent years, food delivery apps have become an indispensable part of daily life for busy office workers.</w:t>
             </w:r>
           </w:p>
         </w:tc>
@@ -345,7 +345,7 @@
                 <w:b w:val="0"/>
                 <w:color w:val="C00000"/>
               </w:rPr>
-              <w:t>(a) Tense / verb form: “has became” → “has become” (after “has” we need the past participle).</w:t>
+              <w:t>(a) Verb form (structure): “have became” → “have become” — “have” must be followed by the past participle, so as written the sentence has no correct verb at all.</w:t>
             </w:r>
           </w:p>
           <w:p>
@@ -354,7 +354,7 @@
                 <w:b w:val="0"/>
                 <w:color w:val="C00000"/>
               </w:rPr>
-              <w:t>(b) Article: “indispensable part” → “an indispensable part” (singular countable noun). (Lesson 1, Pattern 1)</w:t>
+              <w:t>(b) Part of speech: “an indispensably part” → “an indispensable part” — the adjective, not the adverb, modifies the noun “part”. (Lesson 1, Pattern 1)</w:t>
             </w:r>
           </w:p>
         </w:tc>
@@ -384,7 +384,7 @@
                 <w:b w:val="0"/>
                 <w:color w:val="C00000"/>
               </w:rPr>
-              <w:t>Living in a fast-paced society, students are constantly exposed to academic stress.</w:t>
+              <w:t>Living in a fast-paced society, commuters are constantly exposed to noise pollution.</w:t>
             </w:r>
           </w:p>
         </w:tc>
@@ -398,7 +398,7 @@
                 <w:b w:val="0"/>
                 <w:color w:val="C00000"/>
               </w:rPr>
-              <w:t>(a) Part of speech: “constant” → “constantly” (an adverb is needed to modify “exposed”).</w:t>
+              <w:t>(a) Agreement: “commuters is” → “commuters are” (plural subject).</w:t>
             </w:r>
           </w:p>
           <w:p>
@@ -407,7 +407,7 @@
                 <w:b w:val="0"/>
                 <w:color w:val="C00000"/>
               </w:rPr>
-              <w:t>(b) Plural: “academic stresses” → “academic stress” (“stress” is uncountable here). (Lesson 1, Pattern 2)</w:t>
+              <w:t>(b) Plural: “noise pollutions” → “noise pollution” (“pollution” is uncountable). (Lesson 1, Pattern 2)</w:t>
             </w:r>
           </w:p>
         </w:tc>
@@ -437,7 +437,7 @@
                 <w:b w:val="0"/>
                 <w:color w:val="C00000"/>
               </w:rPr>
-              <w:t>In recent times, the issue of plastic pollution has sparked widespread concern across society.</w:t>
+              <w:t>In recent times, the issue of the ageing population has sparked widespread concern across society.</w:t>
             </w:r>
           </w:p>
         </w:tc>
@@ -451,7 +451,7 @@
                 <w:b w:val="0"/>
                 <w:color w:val="C00000"/>
               </w:rPr>
-              <w:t>(a) Article: “issue of plastic pollution” → “the issue of plastic pollution”.</w:t>
+              <w:t>(a) Verb form (structure): “has spark” → “has sparked” — the base form after “has” leaves the clause without a proper verb.</w:t>
             </w:r>
           </w:p>
           <w:p>
@@ -460,7 +460,7 @@
                 <w:b w:val="0"/>
                 <w:color w:val="C00000"/>
               </w:rPr>
-              <w:t>(b) Agreement: “have sparked” → “has sparked” (the subject is the singular “issue”). (Lesson 1, Pattern 3)</w:t>
+              <w:t>(b) Article: “across the society” → “across society” (no article when “society” is used in the general sense). (Lesson 1, Pattern 3)</w:t>
             </w:r>
           </w:p>
         </w:tc>
@@ -490,7 +490,7 @@
                 <w:b w:val="0"/>
                 <w:color w:val="C00000"/>
               </w:rPr>
-              <w:t>It is undeniable that sleep plays a pivotal role in shaping students’ memory and concentration.</w:t>
+              <w:t>It is undeniable that early childhood education plays a pivotal role in shaping children’s characters.</w:t>
             </w:r>
           </w:p>
         </w:tc>
@@ -504,7 +504,7 @@
                 <w:b w:val="0"/>
                 <w:color w:val="C00000"/>
               </w:rPr>
-              <w:t>(a) Agreement: “sleep play” → “sleep plays”.</w:t>
+              <w:t>(a) Agreement: “education play” → “education plays”.</w:t>
             </w:r>
           </w:p>
           <w:p>
@@ -513,7 +513,7 @@
                 <w:b w:val="0"/>
                 <w:color w:val="C00000"/>
               </w:rPr>
-              <w:t>(b) Part of speech / verb form: “in shape” → “in shaping” (after the preposition “in” we need the –ing form). (Lesson 1, Pattern 4)</w:t>
+              <w:t>(b) Verb form (structure): “in shape” → “in shaping” — after the preposition “in” a gerund is needed; “in shape” reads as a noun phrase and breaks the pattern. (Lesson 1, Pattern 4)</w:t>
             </w:r>
           </w:p>
         </w:tc>
@@ -543,7 +543,7 @@
                 <w:b w:val="0"/>
                 <w:color w:val="C00000"/>
               </w:rPr>
-              <w:t>To begin with, part-time work offers students a golden opportunity to gain real-world experience, paving the way for their future careers.</w:t>
+              <w:t>To begin with, cultural exchange programmes offer students a golden opportunity to broaden their horizons, paving the way for a global career.</w:t>
             </w:r>
           </w:p>
         </w:tc>
@@ -557,7 +557,7 @@
                 <w:b w:val="0"/>
                 <w:color w:val="C00000"/>
               </w:rPr>
-              <w:t>(a) Agreement: “work offer” → “work offers”.</w:t>
+              <w:t>(a) Agreement: “programmes offers” → “programmes offer”.</w:t>
             </w:r>
           </w:p>
           <w:p>
@@ -566,7 +566,7 @@
                 <w:b w:val="0"/>
                 <w:color w:val="C00000"/>
               </w:rPr>
-              <w:t>(b) Plural: “their future career” → “their future careers” (more than one student). (Lesson 2, Pattern 1)</w:t>
+              <w:t>(b) Plural: “their horizon” → “their horizons” (more than one student). (Lesson 2, Pattern 1)</w:t>
             </w:r>
           </w:p>
         </w:tc>
@@ -596,7 +596,7 @@
                 <w:b w:val="0"/>
                 <w:color w:val="C00000"/>
               </w:rPr>
-              <w:t>To begin with, volunteering offers teenagers a golden opportunity to meet new people, paving the way for a wider social circle.</w:t>
+              <w:t>To begin with, joining the school choir offers teenagers a golden opportunity to make new friends, paving the way for a more confident attitude to school life.</w:t>
             </w:r>
           </w:p>
         </w:tc>
@@ -610,7 +610,7 @@
                 <w:b w:val="0"/>
                 <w:color w:val="C00000"/>
               </w:rPr>
-              <w:t>(a) Plural: “new peoples” → “new people” (“people” is already plural).</w:t>
+              <w:t>(a) Verb form (structure): “paved” → “paving” — the comment after the comma is a participle phrase; “paved” has no subject and reads as a second main verb, which breaks the sentence.</w:t>
             </w:r>
           </w:p>
           <w:p>
@@ -619,7 +619,7 @@
                 <w:b w:val="0"/>
                 <w:color w:val="C00000"/>
               </w:rPr>
-              <w:t>(b) Verb form: “paved” → “paving” (the comment after the comma is a participle phrase, not a second main verb). (Lesson 2, Pattern 1)</w:t>
+              <w:t>(b) Part of speech: “confidently attitude” → “confident attitude” — an adverb cannot modify a noun. (Lesson 2, Pattern 1)</w:t>
             </w:r>
           </w:p>
         </w:tc>
@@ -649,7 +649,7 @@
                 <w:b w:val="0"/>
                 <w:color w:val="C00000"/>
               </w:rPr>
-              <w:t>From the perspective of students, a balanced timetable allows them to manage their time wisely, which in turn boosts their academic performance.</w:t>
+              <w:t>From the perspective of parents, school counselling services allow them to understand their children better, which in turn strengthens family relationships.</w:t>
             </w:r>
           </w:p>
         </w:tc>
@@ -663,7 +663,7 @@
                 <w:b w:val="0"/>
                 <w:color w:val="C00000"/>
               </w:rPr>
-              <w:t>(a) Agreement: “timetable allow” → “timetable allows”.</w:t>
+              <w:t>(a) Agreement: “services allows” → “services allow”.</w:t>
             </w:r>
           </w:p>
           <w:p>
@@ -672,7 +672,7 @@
                 <w:b w:val="0"/>
                 <w:color w:val="C00000"/>
               </w:rPr>
-              <w:t>(b) Verb form: “boosting” → “boosts” (the “which in turn” clause needs a finite verb). (Lesson 2, Pattern 2)</w:t>
+              <w:t>(b) Verb form (structure): “strengthen” → “strengthens” — the “which in turn” clause needs a finite verb. (Lesson 2, Pattern 2)</w:t>
             </w:r>
           </w:p>
         </w:tc>
@@ -702,7 +702,7 @@
                 <w:b w:val="0"/>
                 <w:color w:val="C00000"/>
               </w:rPr>
-              <w:t>Team sports serve as a powerful means of relieving stress, which enables students to recharge both physically and mentally.</w:t>
+              <w:t>School libraries serve as a powerful means of encouraging students to read, which enables them to become lifelong learners.</w:t>
             </w:r>
           </w:p>
         </w:tc>
@@ -716,7 +716,7 @@
                 <w:b w:val="0"/>
                 <w:color w:val="C00000"/>
               </w:rPr>
-              <w:t>(a) Agreement: “sports serves” → “sports serve”.</w:t>
+              <w:t>(a) Agreement: “libraries serves” → “libraries serve”.</w:t>
             </w:r>
           </w:p>
           <w:p>
@@ -725,7 +725,7 @@
                 <w:b w:val="0"/>
                 <w:color w:val="C00000"/>
               </w:rPr>
-              <w:t>(b) Verb form: “of relieve” → “of relieving” (after the preposition “of” we need the –ing form). (Lesson 2, Pattern 3)</w:t>
+              <w:t>(b) Verb form (structure): “of encourage” → “of encouraging” — after the preposition “of” the gerund is required. (Lesson 2, Pattern 3)</w:t>
             </w:r>
           </w:p>
         </w:tc>
@@ -755,7 +755,7 @@
                 <w:b w:val="0"/>
                 <w:color w:val="C00000"/>
               </w:rPr>
-              <w:t>Admittedly, online lessons offer students greater flexibility. Nevertheless, they cannot replace face-to-face interaction, as real-time discussions spark deeper engagement.</w:t>
+              <w:t>Admittedly, e-books are more convenient. Nevertheless, printed books remain irreplaceable, as reading on paper helps readers to concentrate better.</w:t>
             </w:r>
           </w:p>
         </w:tc>
@@ -769,7 +769,7 @@
                 <w:b w:val="0"/>
                 <w:color w:val="C00000"/>
               </w:rPr>
-              <w:t>(a) Punctuation / sentence boundary: the comma before “nevertheless” becomes a full stop and “Nevertheless” takes a capital letter (otherwise it is a comma splice).</w:t>
+              <w:t>(a) Punctuation / sentence boundary (structure): the comma before “nevertheless” becomes a full stop and “Nevertheless” takes a capital letter — two sentences cannot be joined by a comma alone.</w:t>
             </w:r>
           </w:p>
           <w:p>
@@ -778,7 +778,7 @@
                 <w:b w:val="0"/>
                 <w:color w:val="C00000"/>
               </w:rPr>
-              <w:t>(b) Agreement: “discussions sparks” → “discussions spark” (the subject is plural). (Lesson 2, Pattern 4)</w:t>
+              <w:t>(b) Agreement: “reading … help” → “helps” (the subject is the singular gerund “reading”). (Lesson 2, Pattern 4)</w:t>
             </w:r>
           </w:p>
         </w:tc>
@@ -808,7 +808,7 @@
                 <w:b w:val="0"/>
                 <w:color w:val="C00000"/>
               </w:rPr>
-              <w:t>Reading serves as a powerful means of broadening students’ horizons, which enables them to understand the world beyond the classroom.</w:t>
+              <w:t>It is undeniable that a balanced diet plays a pivotal role in maintaining students’ health.</w:t>
             </w:r>
           </w:p>
         </w:tc>
@@ -822,7 +822,7 @@
                 <w:b w:val="0"/>
                 <w:color w:val="C00000"/>
               </w:rPr>
-              <w:t>(a) Agreement: “Reading serve” → “Reading serves”.</w:t>
+              <w:t>(a) Agreement: “diet play” → “diet plays”.</w:t>
             </w:r>
           </w:p>
           <w:p>
@@ -831,7 +831,7 @@
                 <w:b w:val="0"/>
                 <w:color w:val="C00000"/>
               </w:rPr>
-              <w:t>(b) Article: “the powerful means” → “a powerful means” (the indefinite article goes with this fixed pattern). (Lesson 2, Pattern 3)</w:t>
+              <w:t>(b) Part of speech: “a pivot role” → “a pivotal role” — the adjective “pivotal” is fixed in this pattern. (Lesson 1, Pattern 4)</w:t>
             </w:r>
           </w:p>
         </w:tc>

</xml_diff>